<commit_message>
Record document-printing Preview and verification evidence
</commit_message>
<xml_diff>
--- a/docs/reports/2026-10-23-document-printing.docx
+++ b/docs/reports/2026-10-23-document-printing.docx
@@ -277,7 +277,1485 @@
     </w:p>
     <w:p>
       <w:r>
-        <w:t>The task-owned optimized local server is available at http://127.0.0.1:3120/print-documents with sensitive services disabled. It is not an external sharing address. Protected UI-only Vercel delivery remains pending at this source checkpoint; no new hosted URL is invented.</w:t>
+        <w:t>The task-owned optimized local server is available at http://127.0.0.1:3120/print-documents with sensitive services disabled. It is not an external sharing address. Protected UI-only Vercel delivery and its remaining browser-verification limit are recorded below.</w:t>
+      </w:r>
+    </w:p>
+    <w:p>
+      <w:pPr>
+        <w:pStyle w:val="Heading1"/>
+      </w:pPr>
+      <w:r>
+        <w:t>Recorded local command timeline</w:t>
+      </w:r>
+    </w:p>
+    <w:p>
+      <w:r>
+        <w:t>All times are UTC on 23 October 2026. Local Auth, workflow, storage and email are disabled; one-worker/384 MiB applies to the final build. Original failures remain in this record alongside fixes and retests.</w:t>
+      </w:r>
+    </w:p>
+    <w:tbl>
+      <w:tblPr>
+        <w:tblLayout w:type="fixed"/>
+        <w:tblLook w:firstColumn="1" w:firstRow="1" w:lastColumn="0" w:lastRow="0" w:noHBand="0" w:noVBand="1" w:val="04A0"/>
+        <w:tblW w:w="9360" w:type="dxa"/>
+        <w:tblInd w:w="120" w:type="dxa"/>
+        <w:tblCellMar>
+          <w:top w:w="80" w:type="dxa"/>
+          <w:bottom w:w="80" w:type="dxa"/>
+          <w:start w:w="120" w:type="dxa"/>
+          <w:end w:w="120" w:type="dxa"/>
+        </w:tblCellMar>
+        <w:tblBorders>
+          <w:top w:val="single" w:sz="4" w:color="D0D8E2"/>
+          <w:left w:val="single" w:sz="4" w:color="D0D8E2"/>
+          <w:bottom w:val="single" w:sz="4" w:color="D0D8E2"/>
+          <w:right w:val="single" w:sz="4" w:color="D0D8E2"/>
+          <w:insideH w:val="single" w:sz="4" w:color="D0D8E2"/>
+          <w:insideV w:val="single" w:sz="4" w:color="D0D8E2"/>
+        </w:tblBorders>
+      </w:tblPr>
+      <w:tblGrid>
+        <w:gridCol w:w="1800"/>
+        <w:gridCol w:w="1800"/>
+        <w:gridCol w:w="3500"/>
+        <w:gridCol w:w="2260"/>
+      </w:tblGrid>
+      <w:tr>
+        <w:trPr>
+          <w:cantSplit/>
+          <w:tblHeader/>
+        </w:trPr>
+        <w:tc>
+          <w:tcPr>
+            <w:tcW w:type="dxa" w:w="1800"/>
+            <w:vAlign w:val="center"/>
+            <w:shd w:val="clear" w:fill="E8EEF5"/>
+          </w:tcPr>
+          <w:p>
+            <w:pPr>
+              <w:pStyle w:val="ReportTableText"/>
+            </w:pPr>
+            <w:r>
+              <w:rPr>
+                <w:b/>
+              </w:rPr>
+              <w:t>Actual command</w:t>
+            </w:r>
+          </w:p>
+        </w:tc>
+        <w:tc>
+          <w:tcPr>
+            <w:tcW w:type="dxa" w:w="1800"/>
+            <w:vAlign w:val="center"/>
+            <w:shd w:val="clear" w:fill="E8EEF5"/>
+          </w:tcPr>
+          <w:p>
+            <w:pPr>
+              <w:pStyle w:val="ReportTableText"/>
+            </w:pPr>
+            <w:r>
+              <w:rPr>
+                <w:b/>
+              </w:rPr>
+              <w:t>Start UTC</w:t>
+            </w:r>
+          </w:p>
+        </w:tc>
+        <w:tc>
+          <w:tcPr>
+            <w:tcW w:type="dxa" w:w="3500"/>
+            <w:vAlign w:val="center"/>
+            <w:shd w:val="clear" w:fill="E8EEF5"/>
+          </w:tcPr>
+          <w:p>
+            <w:pPr>
+              <w:pStyle w:val="ReportTableText"/>
+            </w:pPr>
+            <w:r>
+              <w:rPr>
+                <w:b/>
+              </w:rPr>
+              <w:t>End UTC</w:t>
+            </w:r>
+          </w:p>
+        </w:tc>
+        <w:tc>
+          <w:tcPr>
+            <w:tcW w:type="dxa" w:w="2260"/>
+            <w:vAlign w:val="center"/>
+            <w:shd w:val="clear" w:fill="E8EEF5"/>
+          </w:tcPr>
+          <w:p>
+            <w:pPr>
+              <w:pStyle w:val="ReportTableText"/>
+            </w:pPr>
+            <w:r>
+              <w:rPr>
+                <w:b/>
+              </w:rPr>
+              <w:t>Exit</w:t>
+            </w:r>
+          </w:p>
+        </w:tc>
+      </w:tr>
+      <w:tr>
+        <w:trPr>
+          <w:cantSplit/>
+        </w:trPr>
+        <w:tc>
+          <w:tcPr>
+            <w:tcW w:type="dxa" w:w="1800"/>
+            <w:vAlign w:val="center"/>
+          </w:tcPr>
+          <w:p>
+            <w:pPr>
+              <w:pStyle w:val="ReportTableText"/>
+            </w:pPr>
+            <w:r>
+              <w:t>npm ci --include=dev</w:t>
+            </w:r>
+          </w:p>
+        </w:tc>
+        <w:tc>
+          <w:tcPr>
+            <w:tcW w:type="dxa" w:w="1800"/>
+            <w:vAlign w:val="center"/>
+          </w:tcPr>
+          <w:p>
+            <w:pPr>
+              <w:pStyle w:val="ReportTableText"/>
+            </w:pPr>
+            <w:r>
+              <w:t>11:40:04</w:t>
+            </w:r>
+          </w:p>
+        </w:tc>
+        <w:tc>
+          <w:tcPr>
+            <w:tcW w:type="dxa" w:w="3500"/>
+            <w:vAlign w:val="center"/>
+          </w:tcPr>
+          <w:p>
+            <w:pPr>
+              <w:pStyle w:val="ReportTableText"/>
+            </w:pPr>
+            <w:r>
+              <w:t>11:40:35</w:t>
+            </w:r>
+          </w:p>
+        </w:tc>
+        <w:tc>
+          <w:tcPr>
+            <w:tcW w:type="dxa" w:w="2260"/>
+            <w:vAlign w:val="center"/>
+          </w:tcPr>
+          <w:p>
+            <w:pPr>
+              <w:pStyle w:val="ReportTableText"/>
+            </w:pPr>
+            <w:r>
+              <w:t>0</w:t>
+            </w:r>
+          </w:p>
+        </w:tc>
+      </w:tr>
+      <w:tr>
+        <w:trPr>
+          <w:cantSplit/>
+        </w:trPr>
+        <w:tc>
+          <w:tcPr>
+            <w:tcW w:type="dxa" w:w="1800"/>
+            <w:vAlign w:val="center"/>
+          </w:tcPr>
+          <w:p>
+            <w:pPr>
+              <w:pStyle w:val="ReportTableText"/>
+            </w:pPr>
+            <w:r>
+              <w:t>npm run security:runtime</w:t>
+            </w:r>
+          </w:p>
+        </w:tc>
+        <w:tc>
+          <w:tcPr>
+            <w:tcW w:type="dxa" w:w="1800"/>
+            <w:vAlign w:val="center"/>
+          </w:tcPr>
+          <w:p>
+            <w:pPr>
+              <w:pStyle w:val="ReportTableText"/>
+            </w:pPr>
+            <w:r>
+              <w:t>11:40:35</w:t>
+            </w:r>
+          </w:p>
+        </w:tc>
+        <w:tc>
+          <w:tcPr>
+            <w:tcW w:type="dxa" w:w="3500"/>
+            <w:vAlign w:val="center"/>
+          </w:tcPr>
+          <w:p>
+            <w:pPr>
+              <w:pStyle w:val="ReportTableText"/>
+            </w:pPr>
+            <w:r>
+              <w:t>11:40:37</w:t>
+            </w:r>
+          </w:p>
+        </w:tc>
+        <w:tc>
+          <w:tcPr>
+            <w:tcW w:type="dxa" w:w="2260"/>
+            <w:vAlign w:val="center"/>
+          </w:tcPr>
+          <w:p>
+            <w:pPr>
+              <w:pStyle w:val="ReportTableText"/>
+            </w:pPr>
+            <w:r>
+              <w:t>0</w:t>
+            </w:r>
+          </w:p>
+        </w:tc>
+      </w:tr>
+      <w:tr>
+        <w:trPr>
+          <w:cantSplit/>
+        </w:trPr>
+        <w:tc>
+          <w:tcPr>
+            <w:tcW w:type="dxa" w:w="1800"/>
+            <w:vAlign w:val="center"/>
+          </w:tcPr>
+          <w:p>
+            <w:pPr>
+              <w:pStyle w:val="ReportTableText"/>
+            </w:pPr>
+            <w:r>
+              <w:t>npm run test:coverage</w:t>
+            </w:r>
+          </w:p>
+        </w:tc>
+        <w:tc>
+          <w:tcPr>
+            <w:tcW w:type="dxa" w:w="1800"/>
+            <w:vAlign w:val="center"/>
+          </w:tcPr>
+          <w:p>
+            <w:pPr>
+              <w:pStyle w:val="ReportTableText"/>
+            </w:pPr>
+            <w:r>
+              <w:t>11:40:37</w:t>
+            </w:r>
+          </w:p>
+        </w:tc>
+        <w:tc>
+          <w:tcPr>
+            <w:tcW w:type="dxa" w:w="3500"/>
+            <w:vAlign w:val="center"/>
+          </w:tcPr>
+          <w:p>
+            <w:pPr>
+              <w:pStyle w:val="ReportTableText"/>
+            </w:pPr>
+            <w:r>
+              <w:t>11:40:42</w:t>
+            </w:r>
+          </w:p>
+        </w:tc>
+        <w:tc>
+          <w:tcPr>
+            <w:tcW w:type="dxa" w:w="2260"/>
+            <w:vAlign w:val="center"/>
+          </w:tcPr>
+          <w:p>
+            <w:pPr>
+              <w:pStyle w:val="ReportTableText"/>
+            </w:pPr>
+            <w:r>
+              <w:t>0</w:t>
+            </w:r>
+          </w:p>
+        </w:tc>
+      </w:tr>
+      <w:tr>
+        <w:trPr>
+          <w:cantSplit/>
+        </w:trPr>
+        <w:tc>
+          <w:tcPr>
+            <w:tcW w:type="dxa" w:w="1800"/>
+            <w:vAlign w:val="center"/>
+          </w:tcPr>
+          <w:p>
+            <w:pPr>
+              <w:pStyle w:val="ReportTableText"/>
+            </w:pPr>
+            <w:r>
+              <w:t>npm run test:web</w:t>
+            </w:r>
+          </w:p>
+        </w:tc>
+        <w:tc>
+          <w:tcPr>
+            <w:tcW w:type="dxa" w:w="1800"/>
+            <w:vAlign w:val="center"/>
+          </w:tcPr>
+          <w:p>
+            <w:pPr>
+              <w:pStyle w:val="ReportTableText"/>
+            </w:pPr>
+            <w:r>
+              <w:t>11:40:42</w:t>
+            </w:r>
+          </w:p>
+        </w:tc>
+        <w:tc>
+          <w:tcPr>
+            <w:tcW w:type="dxa" w:w="3500"/>
+            <w:vAlign w:val="center"/>
+          </w:tcPr>
+          <w:p>
+            <w:pPr>
+              <w:pStyle w:val="ReportTableText"/>
+            </w:pPr>
+            <w:r>
+              <w:t>11:40:53</w:t>
+            </w:r>
+          </w:p>
+        </w:tc>
+        <w:tc>
+          <w:tcPr>
+            <w:tcW w:type="dxa" w:w="2260"/>
+            <w:vAlign w:val="center"/>
+          </w:tcPr>
+          <w:p>
+            <w:pPr>
+              <w:pStyle w:val="ReportTableText"/>
+            </w:pPr>
+            <w:r>
+              <w:t>1</w:t>
+            </w:r>
+          </w:p>
+        </w:tc>
+      </w:tr>
+      <w:tr>
+        <w:trPr>
+          <w:cantSplit/>
+        </w:trPr>
+        <w:tc>
+          <w:tcPr>
+            <w:tcW w:type="dxa" w:w="1800"/>
+            <w:vAlign w:val="center"/>
+          </w:tcPr>
+          <w:p>
+            <w:pPr>
+              <w:pStyle w:val="ReportTableText"/>
+            </w:pPr>
+            <w:r>
+              <w:t>npm run test:web</w:t>
+            </w:r>
+          </w:p>
+        </w:tc>
+        <w:tc>
+          <w:tcPr>
+            <w:tcW w:type="dxa" w:w="1800"/>
+            <w:vAlign w:val="center"/>
+          </w:tcPr>
+          <w:p>
+            <w:pPr>
+              <w:pStyle w:val="ReportTableText"/>
+            </w:pPr>
+            <w:r>
+              <w:t>11:42:23</w:t>
+            </w:r>
+          </w:p>
+        </w:tc>
+        <w:tc>
+          <w:tcPr>
+            <w:tcW w:type="dxa" w:w="3500"/>
+            <w:vAlign w:val="center"/>
+          </w:tcPr>
+          <w:p>
+            <w:pPr>
+              <w:pStyle w:val="ReportTableText"/>
+            </w:pPr>
+            <w:r>
+              <w:t>11:42:29</w:t>
+            </w:r>
+          </w:p>
+        </w:tc>
+        <w:tc>
+          <w:tcPr>
+            <w:tcW w:type="dxa" w:w="2260"/>
+            <w:vAlign w:val="center"/>
+          </w:tcPr>
+          <w:p>
+            <w:pPr>
+              <w:pStyle w:val="ReportTableText"/>
+            </w:pPr>
+            <w:r>
+              <w:t>0</w:t>
+            </w:r>
+          </w:p>
+        </w:tc>
+      </w:tr>
+      <w:tr>
+        <w:trPr>
+          <w:cantSplit/>
+        </w:trPr>
+        <w:tc>
+          <w:tcPr>
+            <w:tcW w:type="dxa" w:w="1800"/>
+            <w:vAlign w:val="center"/>
+          </w:tcPr>
+          <w:p>
+            <w:pPr>
+              <w:pStyle w:val="ReportTableText"/>
+            </w:pPr>
+            <w:r>
+              <w:t>npm run test:auth:web</w:t>
+            </w:r>
+          </w:p>
+        </w:tc>
+        <w:tc>
+          <w:tcPr>
+            <w:tcW w:type="dxa" w:w="1800"/>
+            <w:vAlign w:val="center"/>
+          </w:tcPr>
+          <w:p>
+            <w:pPr>
+              <w:pStyle w:val="ReportTableText"/>
+            </w:pPr>
+            <w:r>
+              <w:t>11:42:29</w:t>
+            </w:r>
+          </w:p>
+        </w:tc>
+        <w:tc>
+          <w:tcPr>
+            <w:tcW w:type="dxa" w:w="3500"/>
+            <w:vAlign w:val="center"/>
+          </w:tcPr>
+          <w:p>
+            <w:pPr>
+              <w:pStyle w:val="ReportTableText"/>
+            </w:pPr>
+            <w:r>
+              <w:t>11:42:33</w:t>
+            </w:r>
+          </w:p>
+        </w:tc>
+        <w:tc>
+          <w:tcPr>
+            <w:tcW w:type="dxa" w:w="2260"/>
+            <w:vAlign w:val="center"/>
+          </w:tcPr>
+          <w:p>
+            <w:pPr>
+              <w:pStyle w:val="ReportTableText"/>
+            </w:pPr>
+            <w:r>
+              <w:t>0</w:t>
+            </w:r>
+          </w:p>
+        </w:tc>
+      </w:tr>
+      <w:tr>
+        <w:trPr>
+          <w:cantSplit/>
+        </w:trPr>
+        <w:tc>
+          <w:tcPr>
+            <w:tcW w:type="dxa" w:w="1800"/>
+            <w:vAlign w:val="center"/>
+          </w:tcPr>
+          <w:p>
+            <w:pPr>
+              <w:pStyle w:val="ReportTableText"/>
+            </w:pPr>
+            <w:r>
+              <w:t>npm run typecheck:web</w:t>
+            </w:r>
+          </w:p>
+        </w:tc>
+        <w:tc>
+          <w:tcPr>
+            <w:tcW w:type="dxa" w:w="1800"/>
+            <w:vAlign w:val="center"/>
+          </w:tcPr>
+          <w:p>
+            <w:pPr>
+              <w:pStyle w:val="ReportTableText"/>
+            </w:pPr>
+            <w:r>
+              <w:t>11:42:33</w:t>
+            </w:r>
+          </w:p>
+        </w:tc>
+        <w:tc>
+          <w:tcPr>
+            <w:tcW w:type="dxa" w:w="3500"/>
+            <w:vAlign w:val="center"/>
+          </w:tcPr>
+          <w:p>
+            <w:pPr>
+              <w:pStyle w:val="ReportTableText"/>
+            </w:pPr>
+            <w:r>
+              <w:t>11:43:16</w:t>
+            </w:r>
+          </w:p>
+        </w:tc>
+        <w:tc>
+          <w:tcPr>
+            <w:tcW w:type="dxa" w:w="2260"/>
+            <w:vAlign w:val="center"/>
+          </w:tcPr>
+          <w:p>
+            <w:pPr>
+              <w:pStyle w:val="ReportTableText"/>
+            </w:pPr>
+            <w:r>
+              <w:t>0</w:t>
+            </w:r>
+          </w:p>
+        </w:tc>
+      </w:tr>
+      <w:tr>
+        <w:trPr>
+          <w:cantSplit/>
+        </w:trPr>
+        <w:tc>
+          <w:tcPr>
+            <w:tcW w:type="dxa" w:w="1800"/>
+            <w:vAlign w:val="center"/>
+          </w:tcPr>
+          <w:p>
+            <w:pPr>
+              <w:pStyle w:val="ReportTableText"/>
+            </w:pPr>
+            <w:r>
+              <w:t>npm run lint</w:t>
+            </w:r>
+          </w:p>
+        </w:tc>
+        <w:tc>
+          <w:tcPr>
+            <w:tcW w:type="dxa" w:w="1800"/>
+            <w:vAlign w:val="center"/>
+          </w:tcPr>
+          <w:p>
+            <w:pPr>
+              <w:pStyle w:val="ReportTableText"/>
+            </w:pPr>
+            <w:r>
+              <w:t>11:43:16</w:t>
+            </w:r>
+          </w:p>
+        </w:tc>
+        <w:tc>
+          <w:tcPr>
+            <w:tcW w:type="dxa" w:w="3500"/>
+            <w:vAlign w:val="center"/>
+          </w:tcPr>
+          <w:p>
+            <w:pPr>
+              <w:pStyle w:val="ReportTableText"/>
+            </w:pPr>
+            <w:r>
+              <w:t>11:43:30</w:t>
+            </w:r>
+          </w:p>
+        </w:tc>
+        <w:tc>
+          <w:tcPr>
+            <w:tcW w:type="dxa" w:w="2260"/>
+            <w:vAlign w:val="center"/>
+          </w:tcPr>
+          <w:p>
+            <w:pPr>
+              <w:pStyle w:val="ReportTableText"/>
+            </w:pPr>
+            <w:r>
+              <w:t>0</w:t>
+            </w:r>
+          </w:p>
+        </w:tc>
+      </w:tr>
+      <w:tr>
+        <w:trPr>
+          <w:cantSplit/>
+        </w:trPr>
+        <w:tc>
+          <w:tcPr>
+            <w:tcW w:type="dxa" w:w="1800"/>
+            <w:vAlign w:val="center"/>
+          </w:tcPr>
+          <w:p>
+            <w:pPr>
+              <w:pStyle w:val="ReportTableText"/>
+            </w:pPr>
+            <w:r>
+              <w:t>npm run build:web</w:t>
+            </w:r>
+          </w:p>
+        </w:tc>
+        <w:tc>
+          <w:tcPr>
+            <w:tcW w:type="dxa" w:w="1800"/>
+            <w:vAlign w:val="center"/>
+          </w:tcPr>
+          <w:p>
+            <w:pPr>
+              <w:pStyle w:val="ReportTableText"/>
+            </w:pPr>
+            <w:r>
+              <w:t>11:43:30</w:t>
+            </w:r>
+          </w:p>
+        </w:tc>
+        <w:tc>
+          <w:tcPr>
+            <w:tcW w:type="dxa" w:w="3500"/>
+            <w:vAlign w:val="center"/>
+          </w:tcPr>
+          <w:p>
+            <w:pPr>
+              <w:pStyle w:val="ReportTableText"/>
+            </w:pPr>
+            <w:r>
+              <w:t>11:45:35</w:t>
+            </w:r>
+          </w:p>
+        </w:tc>
+        <w:tc>
+          <w:tcPr>
+            <w:tcW w:type="dxa" w:w="2260"/>
+            <w:vAlign w:val="center"/>
+          </w:tcPr>
+          <w:p>
+            <w:pPr>
+              <w:pStyle w:val="ReportTableText"/>
+            </w:pPr>
+            <w:r>
+              <w:t>1</w:t>
+            </w:r>
+          </w:p>
+        </w:tc>
+      </w:tr>
+      <w:tr>
+        <w:trPr>
+          <w:cantSplit/>
+        </w:trPr>
+        <w:tc>
+          <w:tcPr>
+            <w:tcW w:type="dxa" w:w="1800"/>
+            <w:vAlign w:val="center"/>
+          </w:tcPr>
+          <w:p>
+            <w:pPr>
+              <w:pStyle w:val="ReportTableText"/>
+            </w:pPr>
+            <w:r>
+              <w:t>npm --prefix apps/web install next@16.4.2 --save-exact</w:t>
+            </w:r>
+          </w:p>
+        </w:tc>
+        <w:tc>
+          <w:tcPr>
+            <w:tcW w:type="dxa" w:w="1800"/>
+            <w:vAlign w:val="center"/>
+          </w:tcPr>
+          <w:p>
+            <w:pPr>
+              <w:pStyle w:val="ReportTableText"/>
+            </w:pPr>
+            <w:r>
+              <w:t>11:49:08</w:t>
+            </w:r>
+          </w:p>
+        </w:tc>
+        <w:tc>
+          <w:tcPr>
+            <w:tcW w:type="dxa" w:w="3500"/>
+            <w:vAlign w:val="center"/>
+          </w:tcPr>
+          <w:p>
+            <w:pPr>
+              <w:pStyle w:val="ReportTableText"/>
+            </w:pPr>
+            <w:r>
+              <w:t>11:50:51</w:t>
+            </w:r>
+          </w:p>
+        </w:tc>
+        <w:tc>
+          <w:tcPr>
+            <w:tcW w:type="dxa" w:w="2260"/>
+            <w:vAlign w:val="center"/>
+          </w:tcPr>
+          <w:p>
+            <w:pPr>
+              <w:pStyle w:val="ReportTableText"/>
+            </w:pPr>
+            <w:r>
+              <w:t>0</w:t>
+            </w:r>
+          </w:p>
+        </w:tc>
+      </w:tr>
+      <w:tr>
+        <w:trPr>
+          <w:cantSplit/>
+        </w:trPr>
+        <w:tc>
+          <w:tcPr>
+            <w:tcW w:type="dxa" w:w="1800"/>
+            <w:vAlign w:val="center"/>
+          </w:tcPr>
+          <w:p>
+            <w:pPr>
+              <w:pStyle w:val="ReportTableText"/>
+            </w:pPr>
+            <w:r>
+              <w:t>npm --prefix apps/web ci --include=dev</w:t>
+            </w:r>
+          </w:p>
+        </w:tc>
+        <w:tc>
+          <w:tcPr>
+            <w:tcW w:type="dxa" w:w="1800"/>
+            <w:vAlign w:val="center"/>
+          </w:tcPr>
+          <w:p>
+            <w:pPr>
+              <w:pStyle w:val="ReportTableText"/>
+            </w:pPr>
+            <w:r>
+              <w:t>11:50:51</w:t>
+            </w:r>
+          </w:p>
+        </w:tc>
+        <w:tc>
+          <w:tcPr>
+            <w:tcW w:type="dxa" w:w="3500"/>
+            <w:vAlign w:val="center"/>
+          </w:tcPr>
+          <w:p>
+            <w:pPr>
+              <w:pStyle w:val="ReportTableText"/>
+            </w:pPr>
+            <w:r>
+              <w:t>11:53:38</w:t>
+            </w:r>
+          </w:p>
+        </w:tc>
+        <w:tc>
+          <w:tcPr>
+            <w:tcW w:type="dxa" w:w="2260"/>
+            <w:vAlign w:val="center"/>
+          </w:tcPr>
+          <w:p>
+            <w:pPr>
+              <w:pStyle w:val="ReportTableText"/>
+            </w:pPr>
+            <w:r>
+              <w:t>0</w:t>
+            </w:r>
+          </w:p>
+        </w:tc>
+      </w:tr>
+      <w:tr>
+        <w:trPr>
+          <w:cantSplit/>
+        </w:trPr>
+        <w:tc>
+          <w:tcPr>
+            <w:tcW w:type="dxa" w:w="1800"/>
+            <w:vAlign w:val="center"/>
+          </w:tcPr>
+          <w:p>
+            <w:pPr>
+              <w:pStyle w:val="ReportTableText"/>
+            </w:pPr>
+            <w:r>
+              <w:t>npm --prefix apps/web audit --json</w:t>
+            </w:r>
+          </w:p>
+        </w:tc>
+        <w:tc>
+          <w:tcPr>
+            <w:tcW w:type="dxa" w:w="1800"/>
+            <w:vAlign w:val="center"/>
+          </w:tcPr>
+          <w:p>
+            <w:pPr>
+              <w:pStyle w:val="ReportTableText"/>
+            </w:pPr>
+            <w:r>
+              <w:t>11:53:38</w:t>
+            </w:r>
+          </w:p>
+        </w:tc>
+        <w:tc>
+          <w:tcPr>
+            <w:tcW w:type="dxa" w:w="3500"/>
+            <w:vAlign w:val="center"/>
+          </w:tcPr>
+          <w:p>
+            <w:pPr>
+              <w:pStyle w:val="ReportTableText"/>
+            </w:pPr>
+            <w:r>
+              <w:t>11:53:41</w:t>
+            </w:r>
+          </w:p>
+        </w:tc>
+        <w:tc>
+          <w:tcPr>
+            <w:tcW w:type="dxa" w:w="2260"/>
+            <w:vAlign w:val="center"/>
+          </w:tcPr>
+          <w:p>
+            <w:pPr>
+              <w:pStyle w:val="ReportTableText"/>
+            </w:pPr>
+            <w:r>
+              <w:t>0</w:t>
+            </w:r>
+          </w:p>
+        </w:tc>
+      </w:tr>
+      <w:tr>
+        <w:trPr>
+          <w:cantSplit/>
+        </w:trPr>
+        <w:tc>
+          <w:tcPr>
+            <w:tcW w:type="dxa" w:w="1800"/>
+            <w:vAlign w:val="center"/>
+          </w:tcPr>
+          <w:p>
+            <w:pPr>
+              <w:pStyle w:val="ReportTableText"/>
+            </w:pPr>
+            <w:r>
+              <w:t>npm audit --json</w:t>
+            </w:r>
+          </w:p>
+        </w:tc>
+        <w:tc>
+          <w:tcPr>
+            <w:tcW w:type="dxa" w:w="1800"/>
+            <w:vAlign w:val="center"/>
+          </w:tcPr>
+          <w:p>
+            <w:pPr>
+              <w:pStyle w:val="ReportTableText"/>
+            </w:pPr>
+            <w:r>
+              <w:t>11:53:41</w:t>
+            </w:r>
+          </w:p>
+        </w:tc>
+        <w:tc>
+          <w:tcPr>
+            <w:tcW w:type="dxa" w:w="3500"/>
+            <w:vAlign w:val="center"/>
+          </w:tcPr>
+          <w:p>
+            <w:pPr>
+              <w:pStyle w:val="ReportTableText"/>
+            </w:pPr>
+            <w:r>
+              <w:t>11:53:42</w:t>
+            </w:r>
+          </w:p>
+        </w:tc>
+        <w:tc>
+          <w:tcPr>
+            <w:tcW w:type="dxa" w:w="2260"/>
+            <w:vAlign w:val="center"/>
+          </w:tcPr>
+          <w:p>
+            <w:pPr>
+              <w:pStyle w:val="ReportTableText"/>
+            </w:pPr>
+            <w:r>
+              <w:t>0</w:t>
+            </w:r>
+          </w:p>
+        </w:tc>
+      </w:tr>
+      <w:tr>
+        <w:trPr>
+          <w:cantSplit/>
+        </w:trPr>
+        <w:tc>
+          <w:tcPr>
+            <w:tcW w:type="dxa" w:w="1800"/>
+            <w:vAlign w:val="center"/>
+          </w:tcPr>
+          <w:p>
+            <w:pPr>
+              <w:pStyle w:val="ReportTableText"/>
+            </w:pPr>
+            <w:r>
+              <w:t>npm run test:coverage</w:t>
+            </w:r>
+          </w:p>
+        </w:tc>
+        <w:tc>
+          <w:tcPr>
+            <w:tcW w:type="dxa" w:w="1800"/>
+            <w:vAlign w:val="center"/>
+          </w:tcPr>
+          <w:p>
+            <w:pPr>
+              <w:pStyle w:val="ReportTableText"/>
+            </w:pPr>
+            <w:r>
+              <w:t>11:53:42</w:t>
+            </w:r>
+          </w:p>
+        </w:tc>
+        <w:tc>
+          <w:tcPr>
+            <w:tcW w:type="dxa" w:w="3500"/>
+            <w:vAlign w:val="center"/>
+          </w:tcPr>
+          <w:p>
+            <w:pPr>
+              <w:pStyle w:val="ReportTableText"/>
+            </w:pPr>
+            <w:r>
+              <w:t>11:53:49</w:t>
+            </w:r>
+          </w:p>
+        </w:tc>
+        <w:tc>
+          <w:tcPr>
+            <w:tcW w:type="dxa" w:w="2260"/>
+            <w:vAlign w:val="center"/>
+          </w:tcPr>
+          <w:p>
+            <w:pPr>
+              <w:pStyle w:val="ReportTableText"/>
+            </w:pPr>
+            <w:r>
+              <w:t>0</w:t>
+            </w:r>
+          </w:p>
+        </w:tc>
+      </w:tr>
+      <w:tr>
+        <w:trPr>
+          <w:cantSplit/>
+        </w:trPr>
+        <w:tc>
+          <w:tcPr>
+            <w:tcW w:type="dxa" w:w="1800"/>
+            <w:vAlign w:val="center"/>
+          </w:tcPr>
+          <w:p>
+            <w:pPr>
+              <w:pStyle w:val="ReportTableText"/>
+            </w:pPr>
+            <w:r>
+              <w:t>npm run test:web</w:t>
+            </w:r>
+          </w:p>
+        </w:tc>
+        <w:tc>
+          <w:tcPr>
+            <w:tcW w:type="dxa" w:w="1800"/>
+            <w:vAlign w:val="center"/>
+          </w:tcPr>
+          <w:p>
+            <w:pPr>
+              <w:pStyle w:val="ReportTableText"/>
+            </w:pPr>
+            <w:r>
+              <w:t>11:53:49</w:t>
+            </w:r>
+          </w:p>
+        </w:tc>
+        <w:tc>
+          <w:tcPr>
+            <w:tcW w:type="dxa" w:w="3500"/>
+            <w:vAlign w:val="center"/>
+          </w:tcPr>
+          <w:p>
+            <w:pPr>
+              <w:pStyle w:val="ReportTableText"/>
+            </w:pPr>
+            <w:r>
+              <w:t>11:53:57</w:t>
+            </w:r>
+          </w:p>
+        </w:tc>
+        <w:tc>
+          <w:tcPr>
+            <w:tcW w:type="dxa" w:w="2260"/>
+            <w:vAlign w:val="center"/>
+          </w:tcPr>
+          <w:p>
+            <w:pPr>
+              <w:pStyle w:val="ReportTableText"/>
+            </w:pPr>
+            <w:r>
+              <w:t>0</w:t>
+            </w:r>
+          </w:p>
+        </w:tc>
+      </w:tr>
+      <w:tr>
+        <w:trPr>
+          <w:cantSplit/>
+        </w:trPr>
+        <w:tc>
+          <w:tcPr>
+            <w:tcW w:type="dxa" w:w="1800"/>
+            <w:vAlign w:val="center"/>
+          </w:tcPr>
+          <w:p>
+            <w:pPr>
+              <w:pStyle w:val="ReportTableText"/>
+            </w:pPr>
+            <w:r>
+              <w:t>npm run test:auth:web</w:t>
+            </w:r>
+          </w:p>
+        </w:tc>
+        <w:tc>
+          <w:tcPr>
+            <w:tcW w:type="dxa" w:w="1800"/>
+            <w:vAlign w:val="center"/>
+          </w:tcPr>
+          <w:p>
+            <w:pPr>
+              <w:pStyle w:val="ReportTableText"/>
+            </w:pPr>
+            <w:r>
+              <w:t>11:53:57</w:t>
+            </w:r>
+          </w:p>
+        </w:tc>
+        <w:tc>
+          <w:tcPr>
+            <w:tcW w:type="dxa" w:w="3500"/>
+            <w:vAlign w:val="center"/>
+          </w:tcPr>
+          <w:p>
+            <w:pPr>
+              <w:pStyle w:val="ReportTableText"/>
+            </w:pPr>
+            <w:r>
+              <w:t>11:53:59</w:t>
+            </w:r>
+          </w:p>
+        </w:tc>
+        <w:tc>
+          <w:tcPr>
+            <w:tcW w:type="dxa" w:w="2260"/>
+            <w:vAlign w:val="center"/>
+          </w:tcPr>
+          <w:p>
+            <w:pPr>
+              <w:pStyle w:val="ReportTableText"/>
+            </w:pPr>
+            <w:r>
+              <w:t>0</w:t>
+            </w:r>
+          </w:p>
+        </w:tc>
+      </w:tr>
+      <w:tr>
+        <w:trPr>
+          <w:cantSplit/>
+        </w:trPr>
+        <w:tc>
+          <w:tcPr>
+            <w:tcW w:type="dxa" w:w="1800"/>
+            <w:vAlign w:val="center"/>
+          </w:tcPr>
+          <w:p>
+            <w:pPr>
+              <w:pStyle w:val="ReportTableText"/>
+            </w:pPr>
+            <w:r>
+              <w:t>npm run typecheck:web</w:t>
+            </w:r>
+          </w:p>
+        </w:tc>
+        <w:tc>
+          <w:tcPr>
+            <w:tcW w:type="dxa" w:w="1800"/>
+            <w:vAlign w:val="center"/>
+          </w:tcPr>
+          <w:p>
+            <w:pPr>
+              <w:pStyle w:val="ReportTableText"/>
+            </w:pPr>
+            <w:r>
+              <w:t>11:53:59</w:t>
+            </w:r>
+          </w:p>
+        </w:tc>
+        <w:tc>
+          <w:tcPr>
+            <w:tcW w:type="dxa" w:w="3500"/>
+            <w:vAlign w:val="center"/>
+          </w:tcPr>
+          <w:p>
+            <w:pPr>
+              <w:pStyle w:val="ReportTableText"/>
+            </w:pPr>
+            <w:r>
+              <w:t>11:54:10</w:t>
+            </w:r>
+          </w:p>
+        </w:tc>
+        <w:tc>
+          <w:tcPr>
+            <w:tcW w:type="dxa" w:w="2260"/>
+            <w:vAlign w:val="center"/>
+          </w:tcPr>
+          <w:p>
+            <w:pPr>
+              <w:pStyle w:val="ReportTableText"/>
+            </w:pPr>
+            <w:r>
+              <w:t>0</w:t>
+            </w:r>
+          </w:p>
+        </w:tc>
+      </w:tr>
+      <w:tr>
+        <w:trPr>
+          <w:cantSplit/>
+        </w:trPr>
+        <w:tc>
+          <w:tcPr>
+            <w:tcW w:type="dxa" w:w="1800"/>
+            <w:vAlign w:val="center"/>
+          </w:tcPr>
+          <w:p>
+            <w:pPr>
+              <w:pStyle w:val="ReportTableText"/>
+            </w:pPr>
+            <w:r>
+              <w:t>npm run lint</w:t>
+            </w:r>
+          </w:p>
+        </w:tc>
+        <w:tc>
+          <w:tcPr>
+            <w:tcW w:type="dxa" w:w="1800"/>
+            <w:vAlign w:val="center"/>
+          </w:tcPr>
+          <w:p>
+            <w:pPr>
+              <w:pStyle w:val="ReportTableText"/>
+            </w:pPr>
+            <w:r>
+              <w:t>11:54:10</w:t>
+            </w:r>
+          </w:p>
+        </w:tc>
+        <w:tc>
+          <w:tcPr>
+            <w:tcW w:type="dxa" w:w="3500"/>
+            <w:vAlign w:val="center"/>
+          </w:tcPr>
+          <w:p>
+            <w:pPr>
+              <w:pStyle w:val="ReportTableText"/>
+            </w:pPr>
+            <w:r>
+              <w:t>11:55:00</w:t>
+            </w:r>
+          </w:p>
+        </w:tc>
+        <w:tc>
+          <w:tcPr>
+            <w:tcW w:type="dxa" w:w="2260"/>
+            <w:vAlign w:val="center"/>
+          </w:tcPr>
+          <w:p>
+            <w:pPr>
+              <w:pStyle w:val="ReportTableText"/>
+            </w:pPr>
+            <w:r>
+              <w:t>0</w:t>
+            </w:r>
+          </w:p>
+        </w:tc>
+      </w:tr>
+      <w:tr>
+        <w:trPr>
+          <w:cantSplit/>
+        </w:trPr>
+        <w:tc>
+          <w:tcPr>
+            <w:tcW w:type="dxa" w:w="1800"/>
+            <w:vAlign w:val="center"/>
+          </w:tcPr>
+          <w:p>
+            <w:pPr>
+              <w:pStyle w:val="ReportTableText"/>
+            </w:pPr>
+            <w:r>
+              <w:t>npm run build:web</w:t>
+            </w:r>
+          </w:p>
+        </w:tc>
+        <w:tc>
+          <w:tcPr>
+            <w:tcW w:type="dxa" w:w="1800"/>
+            <w:vAlign w:val="center"/>
+          </w:tcPr>
+          <w:p>
+            <w:pPr>
+              <w:pStyle w:val="ReportTableText"/>
+            </w:pPr>
+            <w:r>
+              <w:t>18:35:33</w:t>
+            </w:r>
+          </w:p>
+        </w:tc>
+        <w:tc>
+          <w:tcPr>
+            <w:tcW w:type="dxa" w:w="3500"/>
+            <w:vAlign w:val="center"/>
+          </w:tcPr>
+          <w:p>
+            <w:pPr>
+              <w:pStyle w:val="ReportTableText"/>
+            </w:pPr>
+            <w:r>
+              <w:t>18:39:08</w:t>
+            </w:r>
+          </w:p>
+        </w:tc>
+        <w:tc>
+          <w:tcPr>
+            <w:tcW w:type="dxa" w:w="2260"/>
+            <w:vAlign w:val="center"/>
+          </w:tcPr>
+          <w:p>
+            <w:pPr>
+              <w:pStyle w:val="ReportTableText"/>
+            </w:pPr>
+            <w:r>
+              <w:t>1</w:t>
+            </w:r>
+          </w:p>
+        </w:tc>
+      </w:tr>
+      <w:tr>
+        <w:trPr>
+          <w:cantSplit/>
+        </w:trPr>
+        <w:tc>
+          <w:tcPr>
+            <w:tcW w:type="dxa" w:w="1800"/>
+            <w:vAlign w:val="center"/>
+          </w:tcPr>
+          <w:p>
+            <w:pPr>
+              <w:pStyle w:val="ReportTableText"/>
+            </w:pPr>
+            <w:r>
+              <w:t>npm run build:web</w:t>
+            </w:r>
+          </w:p>
+        </w:tc>
+        <w:tc>
+          <w:tcPr>
+            <w:tcW w:type="dxa" w:w="1800"/>
+            <w:vAlign w:val="center"/>
+          </w:tcPr>
+          <w:p>
+            <w:pPr>
+              <w:pStyle w:val="ReportTableText"/>
+            </w:pPr>
+            <w:r>
+              <w:t>18:39:37</w:t>
+            </w:r>
+          </w:p>
+        </w:tc>
+        <w:tc>
+          <w:tcPr>
+            <w:tcW w:type="dxa" w:w="3500"/>
+            <w:vAlign w:val="center"/>
+          </w:tcPr>
+          <w:p>
+            <w:pPr>
+              <w:pStyle w:val="ReportTableText"/>
+            </w:pPr>
+            <w:r>
+              <w:t>18:41:30</w:t>
+            </w:r>
+          </w:p>
+        </w:tc>
+        <w:tc>
+          <w:tcPr>
+            <w:tcW w:type="dxa" w:w="2260"/>
+            <w:vAlign w:val="center"/>
+          </w:tcPr>
+          <w:p>
+            <w:pPr>
+              <w:pStyle w:val="ReportTableText"/>
+            </w:pPr>
+            <w:r>
+              <w:t>0</w:t>
+            </w:r>
+          </w:p>
+        </w:tc>
+      </w:tr>
+      <w:tr>
+        <w:trPr>
+          <w:cantSplit/>
+        </w:trPr>
+        <w:tc>
+          <w:tcPr>
+            <w:tcW w:type="dxa" w:w="1800"/>
+            <w:vAlign w:val="center"/>
+          </w:tcPr>
+          <w:p>
+            <w:pPr>
+              <w:pStyle w:val="ReportTableText"/>
+            </w:pPr>
+            <w:r>
+              <w:t>npm run security:check</w:t>
+            </w:r>
+          </w:p>
+        </w:tc>
+        <w:tc>
+          <w:tcPr>
+            <w:tcW w:type="dxa" w:w="1800"/>
+            <w:vAlign w:val="center"/>
+          </w:tcPr>
+          <w:p>
+            <w:pPr>
+              <w:pStyle w:val="ReportTableText"/>
+            </w:pPr>
+            <w:r>
+              <w:t>18:41:30</w:t>
+            </w:r>
+          </w:p>
+        </w:tc>
+        <w:tc>
+          <w:tcPr>
+            <w:tcW w:type="dxa" w:w="3500"/>
+            <w:vAlign w:val="center"/>
+          </w:tcPr>
+          <w:p>
+            <w:pPr>
+              <w:pStyle w:val="ReportTableText"/>
+            </w:pPr>
+            <w:r>
+              <w:t>18:41:35</w:t>
+            </w:r>
+          </w:p>
+        </w:tc>
+        <w:tc>
+          <w:tcPr>
+            <w:tcW w:type="dxa" w:w="2260"/>
+            <w:vAlign w:val="center"/>
+          </w:tcPr>
+          <w:p>
+            <w:pPr>
+              <w:pStyle w:val="ReportTableText"/>
+            </w:pPr>
+            <w:r>
+              <w:t>0</w:t>
+            </w:r>
+          </w:p>
+        </w:tc>
+      </w:tr>
+    </w:tbl>
+    <w:p>
+      <w:pPr>
+        <w:spacing w:after="80"/>
+      </w:pPr>
+    </w:p>
+    <w:p>
+      <w:r>
+        <w:t>The additional patched build that encountered System.OutOfMemoryException has tool exit 1 but its wrapper did not persist a completion timestamp; exact start/end are unavailable. The initial pre-patch audit and the static-page HTTP expectation failure also have exit 1 with no timed command record. These missing timestamps are disclosed, not reconstructed from file times. No database migration, advisor, physical-device, genuine provider or complete order-journey test is executed by this slice; those gates remain open.</w:t>
+      </w:r>
+    </w:p>
+    <w:p>
+      <w:r>
+        <w:t>HTTP evidence: seven printing requests and 44 guest/Auth-disabled assertions over eleven further requests pass. Runtime minimum check passes Node 24.22.1. The web test harness retains a Three.js CommonJS deprecation warning; no new Three.js import is added to document printing. Git emits line-ending normalization notices; staged whitespace validation passes.</w:t>
+      </w:r>
+    </w:p>
+    <w:p>
+      <w:pPr>
+        <w:pStyle w:val="Heading1"/>
+      </w:pPr>
+      <w:r>
+        <w:t>Hosted delivery and remaining limits</w:t>
+      </w:r>
+    </w:p>
+    <w:p>
+      <w:r>
+        <w:t xml:space="preserve">Final application source: aab4273e2f987425f5841d08961561176731a825 on feature/phase1-staging-readiness. Deployment dpl_CPijQppRakLZXfRw4hyu9MTNVSay is </w:t>
+      </w:r>
+      <w:r>
+        <w:rPr>
+          <w:b/>
+        </w:rPr>
+        <w:t>READY</w:t>
+      </w:r>
+      <w:r>
+        <w:t xml:space="preserve"> in the existing isolated virtual-ink-ui-test project:</w:t>
+      </w:r>
+    </w:p>
+    <w:p>
+      <w:r>
+        <w:t>https://virtual-ink-ui-test-a95v30h1h-shadowrootsec-5679.vercel.app/print-documents</w:t>
+      </w:r>
+    </w:p>
+    <w:p>
+      <w:r>
+        <w:t>git push --set-upstream origin feature/phase1-staging-readiness exits 0 and creates the review branch in URUUDEV/Virtual-Ink. A separate git ls-remote --heads read confirms aab4273e2f987425f5841d08961561176731a825 on that branch. No staging PR, staging merge or main/production promotion is performed. The report-only delivery commit follows this source checkpoint and does not change application bytes.</w:t>
+      </w:r>
+    </w:p>
+    <w:p>
+      <w:r>
+        <w:t>Vercel inspection confirms the exact source, OIDC environment metadata preview, buildSkipped false, zero aliases/automatic aliases and no automation-bypass binding. The CLI requested Preview; raw target null is accompanied by actual preview environment metadata, not a Production classification. The application environment is ui_test with Auth, uploads, workflow/orders, payments and email disabled. No original project, stable acceptance backend, DNS or production variable is changed. 482 tracked upload files were reviewed; private/environment/reference-archive and Word artifacts were excluded. No inspection plugin or extra brand dependency ships.</w:t>
+      </w:r>
+    </w:p>
+    <w:p>
+      <w:r>
+        <w:t>Provider build logs record a fresh uncached build beginning 18:51:30 UTC, Next.js 16.4.2 detected at 18:51:44, isolation passing with ui_test/Node 24.22.1, compilation passing at 18:52:17, built-in types passing at 18:52:23 and Build Completed at 18:52:37. Read-only inspection at 19:21:15 UTC confirms READY and the exact source. CLI invocation start/completion timestamps were not separately captured; provider build timestamps above are not substituted for those missing command timestamps.</w:t>
+      </w:r>
+    </w:p>
+    <w:p>
+      <w:r>
+        <w:t>Chrome Page.navigate timed out on the new URL, and a subsequent state read also timed out. A single anonymous HEAD attempt from 19:24:24 to 19:24:34 UTC failed with a transport TypeError (exit 1), without an HTTP status. Neither hosted application rendering nor deployment-protection behaviour is established by these failed probes. They do not prove a Vercel outage or an application defect. No protection bypass, alternate domain, configuration weakening or credential request is used. The tested local document-printing tab remains open; the failed navigation tab is cleaned up. Full hosted functional/device acceptance is pending.</w:t>
+      </w:r>
+    </w:p>
+    <w:p>
+      <w:r>
+        <w:t>The Word copy passes the generator's OOXML structure/table audit. Visual rendering was attempted and fails because LibreOffice/soffice is unavailable (WinError 2). No visual Word pagination approval is claimed. Final report-only changes do not alter the deployed application bytes. Source, delivery and report commits remain reviewable on the feature branch; no staging/main merge or release approval occurs. The final report/security scan passes with 492 source files scanned, 134 exclusions and zero findings; staged whitespace checks pass. The earlier 133-exclusion count above records its own prior run, not a changed testing denominator.</w:t>
+      </w:r>
+    </w:p>
+    <w:p>
+      <w:r>
+        <w:rPr>
+          <w:b/>
+        </w:rPr>
+        <w:t>Decision:</w:t>
+      </w:r>
+      <w:r>
+        <w:t xml:space="preserve"> suitable for continued review of the document-preparation interface; NO-GO for taking real document orders or declaring Phase 1/production ready. Genuine secure upload, full document-spec persistence, server pricing, sandbox checkout, provider acceptance, commercial decisions, human/device reviews and approved release/rollback evidence remain required.</w:t>
       </w:r>
     </w:p>
     <w:p>

</xml_diff>